<commit_message>
SSLC briefing email: employee offer + key-employee option pool (Jim's question)
</commit_message>
<xml_diff>
--- a/drafts/SSLC_Offer_Briefing_Email_DRAFT_2026-10-09.docx
+++ b/drafts/SSLC_Offer_Briefing_Email_DRAFT_2026-10-09.docx
@@ -212,6 +212,19 @@
           <w:sz w:val="21"/>
         </w:rPr>
         <w:t>The up-front price reflects what the numbers support today; the earn-outs are how that value grows as goals are met. With $198K in cash and a $5.1M year requiring double last quarter's pace, this offer removes the funding risk and gives SSLC holders a direct share of the upside.</w:t>
+      </w:r>
+    </w:p>
+    <w:p>
+      <w:pPr>
+        <w:spacing w:after="120" w:before="0"/>
+      </w:pPr>
+      <w:r>
+        <w:rPr>
+          <w:b w:val="0"/>
+          <w:i w:val="0"/>
+          <w:sz w:val="21"/>
+        </w:rPr>
+        <w:t>SSLC employees. Jim, to your question: Exos shall offer employment to SSLC employees, including management, support, engineering, and other technical and manufacturing employees, on terms no less favorable than their current employment terms with SSLC (including compensation and benefits), subject to each employee satisfying Exos's standard hiring policies and Exos's completion of confirmatory due diligence. In addition, Exos will develop an option pool for key SSLC employees, to be mutually agreed in the Definitive Agreement.</w:t>
       </w:r>
     </w:p>
     <w:p>

</xml_diff>